<commit_message>
Add revised case materials and academic presentation deck
</commit_message>
<xml_diff>
--- a/案例分析初稿_馆藏结构优化_详析版.docx
+++ b/案例分析初稿_馆藏结构优化_详析版.docx
@@ -8,13 +8,7 @@
         <w:jc w:val="center"/>
       </w:pPr>
       <w:r>
-        <w:rPr>
-          <w:rFonts w:ascii="Times New Roman" w:hAnsi="Times New Roman" w:eastAsia="黑体"/>
-          <w:b/>
-          <w:color w:val="000000"/>
-          <w:sz w:val="36"/>
-        </w:rPr>
-        <w:t>H大学图书馆五年馆藏结构演化、采购特征与</w:t>
+        <w:t>H大学图书馆馆藏结构优化中的取舍：</w:t>
       </w:r>
     </w:p>
     <w:p>
@@ -23,13 +17,7 @@
         <w:jc w:val="center"/>
       </w:pPr>
       <w:r>
-        <w:rPr>
-          <w:rFonts w:ascii="Times New Roman" w:hAnsi="Times New Roman" w:eastAsia="黑体"/>
-          <w:b/>
-          <w:color w:val="000000"/>
-          <w:sz w:val="36"/>
-        </w:rPr>
-        <w:t>学科服务适配优化案例分析</w:t>
+        <w:t>一般学科资源与民族地区文献建设如何兼顾</w:t>
       </w:r>
     </w:p>
     <w:p>
@@ -62,13 +50,7 @@
         <w:jc w:val="center"/>
       </w:pPr>
       <w:r>
-        <w:rPr>
-          <w:rFonts w:ascii="Times New Roman" w:hAnsi="Times New Roman" w:eastAsia="宋体"/>
-          <w:b w:val="0"/>
-          <w:color w:val="000000"/>
-          <w:sz w:val="32"/>
-        </w:rPr>
-        <w:t>主题方向：资源建设与馆藏优化</w:t>
+        <w:t>主题方向：资源建设与特色馆藏</w:t>
       </w:r>
     </w:p>
     <w:p>
@@ -187,13 +169,7 @@
         <w:jc w:val="center"/>
       </w:pPr>
       <w:r>
-        <w:rPr>
-          <w:rFonts w:ascii="Times New Roman" w:hAnsi="Times New Roman" w:eastAsia="宋体"/>
-          <w:b/>
-          <w:color w:val="000000"/>
-          <w:sz w:val="32"/>
-        </w:rPr>
-        <w:t>H大学图书馆五年馆藏结构演化、采购特征与学科服务适配优化案例分析</w:t>
+        <w:t>H大学图书馆馆藏结构优化中的取舍：一般学科资源与民族地区文献建设如何兼顾</w:t>
       </w:r>
     </w:p>
     <w:p>
@@ -217,21 +193,7 @@
         <w:jc w:val="both"/>
       </w:pPr>
       <w:r>
-        <w:rPr>
-          <w:rFonts w:ascii="Times New Roman" w:hAnsi="Times New Roman" w:eastAsia="宋体"/>
-          <w:b/>
-          <w:color w:val="000000"/>
-          <w:sz w:val="24"/>
-        </w:rPr>
-        <w:t>摘要：</w:t>
-      </w:r>
-      <w:r>
-        <w:rPr>
-          <w:rFonts w:ascii="Times New Roman" w:hAnsi="Times New Roman" w:eastAsia="宋体"/>
-          <w:color w:val="000000"/>
-          <w:sz w:val="24"/>
-        </w:rPr>
-        <w:t>以H大学图书馆“五年馆藏.xlsx”为基础数据，本文围绕馆藏建设由“规模增长”转向“结构优化”的现实需求，构建“新增馆藏识别—中图法主类结构提取—采购特征分析—复本与馆藏组织分析—特色资源辨析—优化策略提出”的案例分析路径。研究表明，H大学图书馆2021—2025年可识别新增馆藏共142847册，年度新增规模经历了“2022年收缩—2023年回升—2024年小幅回落—2025年再度扩张”的波动过程。按中图法一级类观察，文学I类始终保持最大规模，哲学宗教B类、政治法律D类和社会科学总论C类比重上升明显，而工业技术T类、经济F类、文化科学教育体育G类和历史地理K类比重有所回落。采购年与出版年的差值中位数多数年份为1至2年，说明新书时效性总体较好；出版社CR5由2021年的19.84%下降到2025年的14.03%，采购来源趋于分散。与此同时，回溯编目、无验收批次记录、工具书资源、民族文献和特色文库在价格、位置、入藏路径和资源属性上与常规新增馆藏存在显著差异，若不加区分，容易影响馆藏评价的准确性。基于此，本文提出按照常规新增馆藏、特色馆藏、工具书资源和捐赠资源分层分类治理的优化路径。</w:t>
+        <w:t>摘要：2026年3月，H大学图书馆在年度资源建设复盘中发现，近五年馆藏变化已经不再只是“增了多少书”的问题。一方面，2021—2025年可识别新增馆藏共142847册，B类哲学宗教、C类社会科学总论、D类政治法律等类别比重上升，T类工业技术、F类经济等传统大类有所回落；另一方面，民族文献借阅、民族文献阅览和民大文库等特色板块持续扩展，三处馆藏合计9015条记录，其中近五年新增7108册，占同期新增馆藏的4.98%。对于一所以服务民族地区人才培养、民族学科建设和文化传承为重要使命的高校而言，馆藏优化已演变为一场现实取舍：有限预算下，究竟应如何在通用学科保障、民族地区文献建设、高价专题资源配置和特色馆藏单列评价之间作出选择。本案例基于“五年馆藏.xlsx”梳理了H大学图书馆五年来的结构变化、采购特征、空间分布和特色资源情况，呈现资源建设团队在下一轮优化方案出台前面临的判断与分歧。</w:t>
       </w:r>
     </w:p>
     <w:p>
@@ -240,21 +202,7 @@
         <w:jc w:val="both"/>
       </w:pPr>
       <w:r>
-        <w:rPr>
-          <w:rFonts w:ascii="Times New Roman" w:hAnsi="Times New Roman" w:eastAsia="Times New Roman"/>
-          <w:b/>
-          <w:color w:val="000000"/>
-          <w:sz w:val="24"/>
-        </w:rPr>
-        <w:t xml:space="preserve">Abstract: </w:t>
-      </w:r>
-      <w:r>
-        <w:rPr>
-          <w:rFonts w:ascii="Times New Roman" w:hAnsi="Times New Roman" w:eastAsia="Times New Roman"/>
-          <w:color w:val="000000"/>
-          <w:sz w:val="24"/>
-        </w:rPr>
-        <w:t>Using the dataset of H University Library's five-year holdings, this case develops an analytical path that covers identification of new acquisitions, extraction of Chinese Library Classification structures, analysis of procurement characteristics, examination of duplicate-copy and shelving organization, distinction of special collections, and formulation of optimization strategies. The analysis shows that the library added 142,847 identifiable new volumes from 2021 to 2025, with a fluctuating trend of contraction in 2022, rebound in 2023, slight decline in 2024, and renewed expansion in 2025. Under the first-level Chinese Library Classification, literature remained the largest category, while philosophy and religion, politics and law, and general social sciences increased their shares significantly; industrial technology, economics, culture-education-sports, and history-geography declined in proportion. The median lag between procurement year and publication year was mostly one to two years, indicating relatively good acquisition timeliness. Publisher concentration also declined, with CR5 dropping from 19.84% in 2021 to 14.03% in 2025. In addition, retrospective records, items without procurement-batch information, reference works, ethnic literature, and special collections differed markedly from regular new acquisitions in terms of price, shelving location, accession route, and resource attributes. Mixing them under one evaluation framework would distort the understanding of collection development. Therefore, this case proposes a layered governance approach that separately manages regular new acquisitions, special collections, reference resources, and donated resources.</w:t>
+        <w:t>Abstract: In March 2026, H University Library reviewed its collection data from 2021 to 2025 and found that collection optimization was no longer simply a matter of adding more books. The library added 142,847 identifiable new volumes in five years, while the shares of philosophy and religion, general social sciences, and politics and law increased, and the shares of industrial technology and economics declined. At the same time, ethnic literature borrowing, ethnic literature reading, and the university special collection continued to expand. These three locations together held 9,015 records, including 7,108 new volumes added during the same five-year period, accounting for 4.98% of all new acquisitions. For a university with responsibilities in ethnic-region talent cultivation, ethnic studies support, and cultural preservation, the key issue is how to balance general disciplinary support, ethnic-region-related collection building, expensive thematic resources, and differentiated evaluation of special collections under a limited budget. Based on the file "Five-year Collection.xlsx," this case presents the data, the context, and the decision point facing the library team before the next round of collection optimization.</w:t>
       </w:r>
     </w:p>
     <w:p>
@@ -263,21 +211,7 @@
         <w:jc w:val="both"/>
       </w:pPr>
       <w:r>
-        <w:rPr>
-          <w:rFonts w:ascii="Times New Roman" w:hAnsi="Times New Roman" w:eastAsia="宋体"/>
-          <w:b/>
-          <w:color w:val="000000"/>
-          <w:sz w:val="24"/>
-        </w:rPr>
-        <w:t>关键词：</w:t>
-      </w:r>
-      <w:r>
-        <w:rPr>
-          <w:rFonts w:ascii="Times New Roman" w:hAnsi="Times New Roman" w:eastAsia="宋体"/>
-          <w:color w:val="000000"/>
-          <w:sz w:val="24"/>
-        </w:rPr>
-        <w:t>高校图书馆；馆藏建设；中图法；资源配置；采购特征；特色馆藏</w:t>
+        <w:t>关键词：高校图书馆；馆藏结构优化；民族地区；民族文献；特色馆藏</w:t>
       </w:r>
     </w:p>
     <w:p>
@@ -286,21 +220,7 @@
         <w:jc w:val="both"/>
       </w:pPr>
       <w:r>
-        <w:rPr>
-          <w:rFonts w:ascii="Times New Roman" w:hAnsi="Times New Roman" w:eastAsia="Times New Roman"/>
-          <w:b/>
-          <w:color w:val="000000"/>
-          <w:sz w:val="24"/>
-        </w:rPr>
-        <w:t xml:space="preserve">Keywords: </w:t>
-      </w:r>
-      <w:r>
-        <w:rPr>
-          <w:rFonts w:ascii="Times New Roman" w:hAnsi="Times New Roman" w:eastAsia="Times New Roman"/>
-          <w:color w:val="000000"/>
-          <w:sz w:val="24"/>
-        </w:rPr>
-        <w:t>university library; collection development; Chinese Library Classification; resource allocation; procurement characteristics; special collections</w:t>
+        <w:t>Keywords: university library; collection optimization; ethnic regions; ethnic literature; special collections</w:t>
       </w:r>
     </w:p>
     <w:p>
@@ -346,12 +266,7 @@
         <w:jc w:val="both"/>
       </w:pPr>
       <w:r>
-        <w:rPr>
-          <w:rFonts w:ascii="Times New Roman" w:hAnsi="Times New Roman" w:eastAsia="楷体"/>
-          <w:color w:val="000000"/>
-          <w:sz w:val="18"/>
-        </w:rPr>
-        <w:t>* 2. 本案例授权全国图书情报专业学位研究生教育指导委员会使用。</w:t>
+        <w:t>* 2. 本案例授权全国图书情报专业学位研究生教育指导委员会使用，全国图书情报专业学位研究生教育指导委员会享有复制权、修改权、发表权、发行权、信息网络传播权、改编权、汇编权和翻译权。</w:t>
       </w:r>
     </w:p>
     <w:p>
@@ -404,13 +319,7 @@
         <w:jc w:val="both"/>
       </w:pPr>
       <w:r>
-        <w:rPr>
-          <w:rFonts w:ascii="Times New Roman" w:hAnsi="Times New Roman" w:eastAsia="宋体"/>
-          <w:b w:val="0"/>
-          <w:color w:val="000000"/>
-          <w:sz w:val="24"/>
-        </w:rPr>
-        <w:t>在高校图书馆从“资源保障型”向“数据驱动型”和“精准服务型”转变的过程中，馆藏建设工作的评价逻辑正在发生变化。过去较长时期内，馆藏工作主要依赖增量建设、品种扩充和学科覆盖来体现发展水平，而在当前资源价格上涨、读者需求分化、学科建设动态调整和特色资源建设不断深化的背景下，单纯从册数增长或馆藏总量出发，已经不足以准确解释馆藏建设质量。图书馆更需要回答的是：新增资源具体增长在哪些中图法类别、不同类别的变化是否与学校学科布局相匹配、采购时效和来源是否合理、特色资源是否被统一口径遮蔽，以及后续资源建设应沿着何种方向优化。</w:t>
+        <w:t>2026年3月，H大学图书馆年度资源建设复盘会开到了第三个小时，讨论的焦点却越来越集中。过去五年，图书馆新增馆藏并没有停止增长，但增长的方向已经发生变化：B类哲学宗教、C类社会科学总论和D类政治法律持续上升，T类工业技术、F类经济等传统大类有所回落；与此同时，民族文献借阅、民族文献阅览和民大文库等特色板块不断补充，一批与民族文化传承、民族地区研究和中华民族共同体意识相关的文献进入馆藏。数据越清楚，选择反而越难。</w:t>
       </w:r>
     </w:p>
     <w:p>
@@ -420,13 +329,7 @@
         <w:jc w:val="both"/>
       </w:pPr>
       <w:r>
-        <w:rPr>
-          <w:rFonts w:ascii="Times New Roman" w:hAnsi="Times New Roman" w:eastAsia="宋体"/>
-          <w:b w:val="0"/>
-          <w:color w:val="000000"/>
-          <w:sz w:val="24"/>
-        </w:rPr>
-        <w:t>H大学图书馆现有“五年馆藏.xlsx”记录166382条，字段涵盖题名、出版社、出版年、价格、索书号、馆藏地、编目方式、验收批次等信息。该数据既包含近五年新增编目的馆藏，也包含回溯编目、工具书、多卷书、捐赠资源和特色文库。其优势在于既能支撑常规新增馆藏的年度分析，也能揭示特色资源与历史存量资源对总体馆藏判断的影响。因此，本文以该数据为基础，尝试从中图法分类、年度变化、采购来源、复本结构和特色资源等多个维度，对H大学图书馆五年馆藏建设进行尽可能完整的案例分析。</w:t>
+        <w:t>问题在于，H大学并不是一所办学定位高度同质化的普通高校。学校既要满足一般学科的教学科研需求，也承担民族地区人才培养、民族学科建设、民族文化传承和服务铸牢中华民族共同体意识的任务。预算并没有随着任务同步扩张，空间也并非无限供给，评价口径更尚未完全分层。在这种情况下，图书馆下一轮馆藏优化究竟应该优先补强哪些板块？民族地区文献建设是否应当从全馆总量中单独拉出来看？高价专题资源、课程复本和特色馆藏又该如何放在同一张资源建设清单上统筹？这正是本案例要呈现的情境。</w:t>
       </w:r>
     </w:p>
     <w:p>
@@ -435,13 +338,7 @@
         <w:jc w:val="left"/>
       </w:pPr>
       <w:r>
-        <w:rPr>
-          <w:rFonts w:ascii="Times New Roman" w:hAnsi="Times New Roman" w:eastAsia="黑体"/>
-          <w:b/>
-          <w:color w:val="000000"/>
-          <w:sz w:val="28"/>
-        </w:rPr>
-        <w:t>1. 数据来源、分类口径与分析框架</w:t>
+        <w:t>1. 数据来源与观察口径</w:t>
       </w:r>
     </w:p>
     <w:p>
@@ -466,13 +363,7 @@
         <w:jc w:val="both"/>
       </w:pPr>
       <w:r>
-        <w:rPr>
-          <w:rFonts w:ascii="Times New Roman" w:hAnsi="Times New Roman" w:eastAsia="宋体"/>
-          <w:b w:val="0"/>
-          <w:color w:val="000000"/>
-          <w:sz w:val="24"/>
-        </w:rPr>
-        <w:t>本文数据来自工作区文件“五年馆藏.xlsx”。原始记录共166382条，其中新书编目146922条，回溯编目19460条。为了识别真实的五年新增馆藏，本文以“编目方式=新书编目”且“验收批次”中可识别出2021—2025年份信息的记录作为主分析样本，共142847条；其余无验收批次记录、回溯编目记录及特殊资源记录作为对照样本，用于分析特色馆藏、工具书资源和历史存量整理的影响。这样做的原因在于：出版年只能反映文献出版时间，不能直接代表文献入馆时间，而验收批次更接近采购与验收的时间逻辑。</w:t>
+        <w:t>案例所用数据来自工作区文件“五年馆藏.xlsx”。原始记录共166382条，其中新书编目146922条，回溯编目19460条。为尽量还原2021—2025年的真实新增情况，馆员团队把“编目方式=新书编目”且“验收批次”可识别年份的记录作为主分析样本，共142847条；其余无验收批次记录、回溯编目记录及特殊资源记录作为对照样本。之所以这样处理，是因为出版年只能说明文献出版时间，不能直接说明入馆时间，而验收批次更接近采购与验收的实际节奏。</w:t>
       </w:r>
     </w:p>
     <w:p>
@@ -881,13 +772,7 @@
         <w:jc w:val="left"/>
       </w:pPr>
       <w:r>
-        <w:rPr>
-          <w:rFonts w:ascii="Times New Roman" w:hAnsi="Times New Roman" w:eastAsia="黑体"/>
-          <w:b/>
-          <w:color w:val="000000"/>
-          <w:sz w:val="24"/>
-        </w:rPr>
-        <w:t>1.2 中图法分类口径</w:t>
+        <w:t>1.2 分类与比较口径</w:t>
       </w:r>
     </w:p>
     <w:p>
@@ -897,13 +782,7 @@
         <w:jc w:val="both"/>
       </w:pPr>
       <w:r>
-        <w:rPr>
-          <w:rFonts w:ascii="Times New Roman" w:hAnsi="Times New Roman" w:eastAsia="宋体"/>
-          <w:b w:val="0"/>
-          <w:color w:val="000000"/>
-          <w:sz w:val="24"/>
-        </w:rPr>
-        <w:t>本文严格依据索书号提取中图法主类代码进行分类。对于全馆五年结构分析，采用中图法一级类代码，即按索书号首字母识别A至Z的一级类，从而完整展开文学、历史地理、经济、哲学宗教、工业技术等大类的变化。这样可以避免只看局部热门类别而忽视整体结构。与此同时，考虑到T类“工业技术”内部包含自动化技术与计算机技术、电子通信、建筑、轻工等差异很大的子类，若仅停留在一级类，容易掩盖其内部重心变化。因此，在T类内部分析时，本文进一步依据索书号前两位字母提取TP、TN、TU、TS等二级类代码进行细分。也就是说，本文既按照中图法一级类全面摊开，又在需要时对重点大类做二级展开。</w:t>
+        <w:t>案例按索书号提取中图法主类代码来观察结构变化。全馆层面先看一级类，便于把文学、历史地理、经济、哲学宗教、工业技术等大类整体摊开；涉及T类工业技术时，再继续拆到TP、TN、TU、TS等二级类，避免把计算机、电子通信、建筑和轻工等差异很大的资源混在一起看。这样既能看清全馆结构，也能把重点类别的内部变化说透。</w:t>
       </w:r>
     </w:p>
     <w:p>
@@ -912,13 +791,7 @@
         <w:jc w:val="left"/>
       </w:pPr>
       <w:r>
-        <w:rPr>
-          <w:rFonts w:ascii="Times New Roman" w:hAnsi="Times New Roman" w:eastAsia="黑体"/>
-          <w:b/>
-          <w:color w:val="000000"/>
-          <w:sz w:val="24"/>
-        </w:rPr>
-        <w:t>1.3 指标体系</w:t>
+        <w:t>1.3 课堂讨论需要关注的几个维度</w:t>
       </w:r>
     </w:p>
     <w:p>
@@ -928,13 +801,7 @@
         <w:jc w:val="both"/>
       </w:pPr>
       <w:r>
-        <w:rPr>
-          <w:rFonts w:ascii="Times New Roman" w:hAnsi="Times New Roman" w:eastAsia="宋体"/>
-          <w:b w:val="0"/>
-          <w:color w:val="000000"/>
-          <w:sz w:val="24"/>
-        </w:rPr>
-        <w:t>本文构建四类分析指标。第一类是规模指标，包括年度新增册数、题名数和ISBN数，用于观察五年新增馆藏的规模波动。第二类是结构指标，包括中图法一级类年度册数、占比变化、T类二级展开、馆藏地分布等，用于判断资源配置的重心变化。第三类是采购指标，包括均价、中位价、价格高位数、采购年与出版年的差值、出版社集中度和供应商分布，用于评估采购效率和来源结构。第四类是组织与治理指标，包括复本结构、无验收批次记录、特色馆藏地点及高价文献样本等，用于辨析常规新增与特殊资源之间的差异。</w:t>
+        <w:t>为便于课堂讨论，文中主要从四个维度展开：先看新增规模与出版时效，再看中图法结构变化，然后看出版社、供应商、馆藏地和复本配置，最后把民族文献、民大文库、工具书和捐赠资源单独拉出来比较。这样的安排既能交代全馆背景，也能把真正的决策难点放到台面上。</w:t>
       </w:r>
     </w:p>
     <w:p>
@@ -943,13 +810,7 @@
         <w:jc w:val="left"/>
       </w:pPr>
       <w:r>
-        <w:rPr>
-          <w:rFonts w:ascii="Times New Roman" w:hAnsi="Times New Roman" w:eastAsia="黑体"/>
-          <w:b/>
-          <w:color w:val="000000"/>
-          <w:sz w:val="28"/>
-        </w:rPr>
-        <w:t>2. 五年新增馆藏的总体变化</w:t>
+        <w:t>2. 复盘中首先看到的全馆变化</w:t>
       </w:r>
     </w:p>
     <w:p>
@@ -3166,13 +3027,7 @@
         <w:jc w:val="left"/>
       </w:pPr>
       <w:r>
-        <w:rPr>
-          <w:rFonts w:ascii="Times New Roman" w:hAnsi="Times New Roman" w:eastAsia="黑体"/>
-          <w:b/>
-          <w:color w:val="000000"/>
-          <w:sz w:val="28"/>
-        </w:rPr>
-        <w:t>3. 中图法一级类结构的逐年变化</w:t>
+        <w:t>3. 结构变化：哪些类别在上升，哪些类别在回落</w:t>
       </w:r>
     </w:p>
     <w:p>
@@ -17500,13 +17355,7 @@
         <w:jc w:val="both"/>
       </w:pPr>
       <w:r>
-        <w:rPr>
-          <w:rFonts w:ascii="Times New Roman" w:hAnsi="Times New Roman" w:eastAsia="宋体"/>
-          <w:b w:val="0"/>
-          <w:color w:val="000000"/>
-          <w:sz w:val="24"/>
-        </w:rPr>
-        <w:t>由于T类工业技术在一级类层面整体下降较快，本文进一步将其拆分为二级类。结果显示，TP类自动化技术、计算机技术是T类内部规模最大的子类，但其年度册数从2021年的2103册降至2025年的1115册，是T类占比下降的最主要原因。TN类无线电电子学、电信技术也从587册降至212册。与之相比，TU类建筑科学在五年内保持相对稳定，TS类轻工业、手工业虽有波动，但下降幅度小于TP和TN。换言之，T类整体走弱并不是所有技术子类共同下降，而主要是计算机技术和电子通信类资源的比重回落所致。</w:t>
+        <w:t>由于T类工业技术在一级类层面整体下降较快，馆员团队又把它继续拆到二级类去看。结果显示，TP类自动化技术、计算机技术仍是T类内部规模最大的子类，但其年度册数从2021年的2103册降至2025年的1115册，是T类占比下降的最主要原因。TN类无线电电子学、电信技术也从587册降至212册。与之相比，TU类建筑科学在五年内保持相对稳定，TS类轻工业、手工业虽有波动，但下降幅度小于TP和TN。换言之，T类整体走弱并不是所有技术子类一起下降，而主要是计算机技术和电子通信类资源的比重回落所致。</w:t>
       </w:r>
     </w:p>
     <w:p>
@@ -20464,13 +20313,7 @@
         <w:jc w:val="left"/>
       </w:pPr>
       <w:r>
-        <w:rPr>
-          <w:rFonts w:ascii="Times New Roman" w:hAnsi="Times New Roman" w:eastAsia="黑体"/>
-          <w:b/>
-          <w:color w:val="000000"/>
-          <w:sz w:val="28"/>
-        </w:rPr>
-        <w:t>4. 采购来源、馆藏组织与复本结构</w:t>
+        <w:t>4. 采购与馆藏组织：变化发生在哪里</w:t>
       </w:r>
     </w:p>
     <w:p>
@@ -24964,13 +24807,7 @@
         <w:jc w:val="left"/>
       </w:pPr>
       <w:r>
-        <w:rPr>
-          <w:rFonts w:ascii="Times New Roman" w:hAnsi="Times New Roman" w:eastAsia="黑体"/>
-          <w:b/>
-          <w:color w:val="000000"/>
-          <w:sz w:val="28"/>
-        </w:rPr>
-        <w:t>5. 特色馆藏与非新增样本分析</w:t>
+        <w:t>5. 民族地区办学背景下的特色资源识别</w:t>
       </w:r>
     </w:p>
     <w:p>
@@ -25026,13 +24863,7 @@
         <w:jc w:val="both"/>
       </w:pPr>
       <w:r>
-        <w:rPr>
-          <w:rFonts w:ascii="Times New Roman" w:hAnsi="Times New Roman" w:eastAsia="宋体"/>
-          <w:b w:val="0"/>
-          <w:color w:val="000000"/>
-          <w:sz w:val="24"/>
-        </w:rPr>
-        <w:t>从五个最有代表性的特色馆藏地点看，民族文献借阅（L203）和民族文献阅览（L201）都以K类历史地理为主，但后者均价高达221.76元，明显高于前者，说明其资源更偏向专题研究型文献。民大文库L102均价达到262.04元，也呈现出较强的文库与特色收藏属性。相比之下，捐赠书阅览室L109价格中位数仅1.4元，而多卷工具阅览4（L303）中位价为0元，体现出赠送资源和工具书资源的非市场化特征。</w:t>
+        <w:t>从五个最有代表性的特色馆藏地点看，民族文献借阅（L203）、民族文献阅览（L201）和民大文库L102并不是一般意义上的“边缘书架”，而是H大学服务民族地区办学定位的重要资源板块。三处馆藏合计9015条记录，其中2021—2025年新增7108册，占全馆同期新增馆藏的4.98%。按中图法看，这部分资源以K类历史地理为核心，同时覆盖I类文学、J类艺术和C类社会科学总论，既支撑民族历史文化研究，也直接关联民族地区治理、民族学科建设和中华民族共同体意识教育。进一步比较可以发现，民族文献借阅（L203）和民族文献阅览（L201）都以K类为主，但后者均价高达221.76元，明显高于前者，更像专题研究型资源；民大文库L102均价达到262.04元，也体现出文库与特色收藏属性。相比之下，捐赠书阅览室L109价格中位数仅1.4元，多卷工具阅览4（L303）中位价为0元，资源属性与前述特色馆藏并不相同。</w:t>
       </w:r>
     </w:p>
     <w:p>
@@ -26062,13 +25893,7 @@
         <w:jc w:val="both"/>
       </w:pPr>
       <w:r>
-        <w:rPr>
-          <w:rFonts w:ascii="Times New Roman" w:hAnsi="Times New Roman" w:eastAsia="宋体"/>
-          <w:b w:val="0"/>
-          <w:color w:val="000000"/>
-          <w:sz w:val="24"/>
-        </w:rPr>
-        <w:t>特色资源与常规新增馆藏并存，是H大学图书馆馆藏体系的重要特征。一方面，这说明图书馆在民族文献、特色文库和工具型资源方面具有较强辨识度；另一方面，也意味着如果以“统一口径”评价全部馆藏，很容易掩盖不同资源之间在入藏逻辑、服务对象和价值结构上的根本差异。对于竞赛案例而言，这种差异本身不是负担，反而是可以被转化为特色资源治理亮点的切入点。</w:t>
+        <w:t>这意味着，H大学如果继续用统一口径评价全部馆藏，就会同时失真两个方面：一方面，高价专题文献、民族地区文献和特色文库的建设价值容易被普通均价和总量指标稀释；另一方面，图书馆服务民族地区人才培养、文化传承和学科支撑的责任，也容易在“全馆平均数”中变得不明显。对教学型案例而言，真正值得讨论的不是“特色资源要不要建”，而是“特色资源应当在馆藏优化中占据什么位置、用什么方式评价、如何转化为课程和科研服务”。</w:t>
       </w:r>
     </w:p>
     <w:p>
@@ -26077,13 +25902,7 @@
         <w:jc w:val="left"/>
       </w:pPr>
       <w:r>
-        <w:rPr>
-          <w:rFonts w:ascii="Times New Roman" w:hAnsi="Times New Roman" w:eastAsia="黑体"/>
-          <w:b/>
-          <w:color w:val="000000"/>
-          <w:sz w:val="28"/>
-        </w:rPr>
-        <w:t>6. 主要发现与问题归纳</w:t>
+        <w:t>6. 摆在馆员团队面前的现实问题</w:t>
       </w:r>
     </w:p>
     <w:p>
@@ -26093,13 +25912,7 @@
         <w:jc w:val="both"/>
       </w:pPr>
       <w:r>
-        <w:rPr>
-          <w:rFonts w:ascii="Times New Roman" w:hAnsi="Times New Roman" w:eastAsia="宋体"/>
-          <w:b w:val="0"/>
-          <w:color w:val="000000"/>
-          <w:sz w:val="24"/>
-        </w:rPr>
-        <w:t>综合前述分析，可以归纳出四个方面的核心发现。第一，五年新增馆藏总体保持较高规模，但年度波动明显，说明资源建设在稳态运行中仍受到采购周期、目录结构和资源价格等因素影响。第二，按中图法一级类观察，馆藏重心正在由工业技术和经济等类别，部分转向哲学宗教、政治法律、社会科学总论等类别，显示出资源配置逻辑的阶段性调整。第三，采购时效总体较好，出版社来源趋于分散，供应商呈现明显轮动，说明采购体系在稳定中具有一定弹性。第四，工具书、捐赠书、民族文献和特色文库与常规新增馆藏存在明显差异，统一统计口径会削弱分析结论的可信度。</w:t>
+        <w:t>随着复盘推进，馆员团队的分歧越来越具体。第一，全馆新增结构确实在变化，但这种变化究竟是学校学科布局调整的结果，还是采购目录、供应商轮动和价格约束带来的阶段性波动，大家并没有完全达成一致。第二，民族文献借阅、民族文献阅览和民大文库已经形成一定规模，也出现了共同体意识专题文献等新的资源投向，但这类资源究竟应被视为“特色补充”还是“战略重点”，馆内认识并不统一。第三，课程用书复本、高价影印本和研究型专题文献同时存在，如果仍用同一套预算论证与绩效指标，势必会相互挤压。第四，图书馆既要服务一般学科教学科研，也要回应民族地区办学特色和文化传承任务，资源建设目标开始出现多重牵引。</w:t>
       </w:r>
     </w:p>
     <w:p>
@@ -26109,13 +25922,7 @@
         <w:jc w:val="both"/>
       </w:pPr>
       <w:r>
-        <w:rPr>
-          <w:rFonts w:ascii="Times New Roman" w:hAnsi="Times New Roman" w:eastAsia="宋体"/>
-          <w:b w:val="0"/>
-          <w:color w:val="000000"/>
-          <w:sz w:val="24"/>
-        </w:rPr>
-        <w:t>在问题层面，H大学图书馆至少面临以下几点需要进一步关注。其一，现有馆藏数据虽然足以支持分析，但评价口径尚未完全分层，新增采购、历史回溯和特殊资源仍需要更清晰地在制度和数据层面进行区分。其二，中图法结构变化已经被识别出来，但结构变化与学校学科布局、课程设置和读者需求之间的对应关系还需要更多外部证据支撑。其三，高复本结构、高价专题文献和价格异常值并存，说明后续需要更精细的复本策略与高价资源论证机制。其四，特色馆藏优势已经存在，但尚需进一步转化为可被外部清晰识别的资源建设故事和服务成效。</w:t>
+        <w:t>因此，摆在资源建设部面前的已经不是单一的统计问题，而是几个相互牵连的管理选择：下一轮预算应更多投向B类、C类、D类等近年上升明显的通用板块，还是单列民族地区文献与特色馆藏经费；民族地区相关资源应继续放在特色馆藏体系中独立评价，还是纳入全馆统一考核；民族文献借阅、民族文献阅览和民大文库之间应如何分工，才能既服务研究又服务教学；高价专题文献与高复本课程资源又该如何分别论证。</w:t>
       </w:r>
     </w:p>
     <w:p>
@@ -26124,13 +25931,7 @@
         <w:jc w:val="left"/>
       </w:pPr>
       <w:r>
-        <w:rPr>
-          <w:rFonts w:ascii="Times New Roman" w:hAnsi="Times New Roman" w:eastAsia="黑体"/>
-          <w:b/>
-          <w:color w:val="000000"/>
-          <w:sz w:val="28"/>
-        </w:rPr>
-        <w:t>7. 优化路径</w:t>
+        <w:t>7. 资源建设会上形成的几种思路</w:t>
       </w:r>
     </w:p>
     <w:p>
@@ -26140,13 +25941,7 @@
         <w:jc w:val="both"/>
       </w:pPr>
       <w:r>
-        <w:rPr>
-          <w:rFonts w:ascii="Times New Roman" w:hAnsi="Times New Roman" w:eastAsia="宋体"/>
-          <w:b w:val="0"/>
-          <w:color w:val="000000"/>
-          <w:sz w:val="24"/>
-        </w:rPr>
-        <w:t>第一，建立分层分类的数据治理和评价框架。建议将馆藏数据至少划分为常规新增馆藏、特色馆藏、工具书资源和捐赠资源四大类，分别设置统计口径、质量指标和评估目标。常规新增馆藏重点考察中图法结构、采购时效和经费绩效，特色馆藏重点考察学科支撑和文化传承价值，工具书资源重点考察保障功能，捐赠资源重点考察适配性和整理效率。</w:t>
+        <w:t>第一种思路，是先把数据口径理顺。也就是说，常规新增馆藏、特色馆藏、工具书资源和捐赠资源不再放在同一口径下比较，而是分别统计、分别评价。支持这一思路的馆员认为，只有先把不同资源放回各自的逻辑中，后续的经费讨论和绩效评估才不会失真。</w:t>
       </w:r>
     </w:p>
     <w:p>
@@ -26156,13 +25951,7 @@
         <w:jc w:val="both"/>
       </w:pPr>
       <w:r>
-        <w:rPr>
-          <w:rFonts w:ascii="Times New Roman" w:hAnsi="Times New Roman" w:eastAsia="宋体"/>
-          <w:b w:val="0"/>
-          <w:color w:val="000000"/>
-          <w:sz w:val="24"/>
-        </w:rPr>
-        <w:t>第二，形成以采购年为核心的年度监测机制。建议持续保留并规范验收批次、索书号、价格、馆藏地、题名和ISBN等核心字段，围绕年度新增册数、中图法一级类占比、T类内部结构、出版社CR5、供应商分布和出版时差等指标建立年度看板，使馆藏建设真正具备可追踪、可比较、可解释的分析基础。</w:t>
+        <w:t>第二种思路，是把民族地区文献和民族文献特色馆藏从“全馆平均数”中单列出来，形成独立的年度监测板块。这样既能看清民族文献借阅、民族文献阅览和民大文库的投入节奏，也能更直接地判断这些资源是否真正服务了学校的民族学科、民族地区研究和共同体意识教育。</w:t>
       </w:r>
     </w:p>
     <w:p>
@@ -26172,13 +25961,7 @@
         <w:jc w:val="both"/>
       </w:pPr>
       <w:r>
-        <w:rPr>
-          <w:rFonts w:ascii="Times New Roman" w:hAnsi="Times New Roman" w:eastAsia="宋体"/>
-          <w:b w:val="0"/>
-          <w:color w:val="000000"/>
-          <w:sz w:val="24"/>
-        </w:rPr>
-        <w:t>第三，围绕中图法结构变化优化资源配置。对于B类、C类、D类等增长明显的类别，应进一步结合学校学科建设和课程体系判断其增长是否需要持续巩固；对于T类、F类和G类等回落类别，则应分析其下降是由于纸电替代、需求变化还是采购偏移，从而避免在资源调整中出现“数量下降即价值下降”的误判。</w:t>
+        <w:t>第三种思路，是围绕学校学科布局重新平衡通用资源与特色资源。B类、C类、D类近年持续上升，是否意味着图书馆应继续顺势加码；T类、F类、G类回落，究竟是需求变化、纸电替代，还是采购偏移；而民族地区文献建设又应在全馆资源盘子中占多大比重，这些都需要放到学校课程体系、科研方向和人才培养任务中重新判断。</w:t>
       </w:r>
     </w:p>
     <w:p>
@@ -26188,13 +25971,7 @@
         <w:jc w:val="both"/>
       </w:pPr>
       <w:r>
-        <w:rPr>
-          <w:rFonts w:ascii="Times New Roman" w:hAnsi="Times New Roman" w:eastAsia="宋体"/>
-          <w:b w:val="0"/>
-          <w:color w:val="000000"/>
-          <w:sz w:val="24"/>
-        </w:rPr>
-        <w:t>第四，优化复本与高价文献治理。对高复本配置应区分课程教学需求、重点荐读需求和专题建设需求；对高价影印本、工具书和专题文献，则应设置单独的遴选论证与绩效跟踪机制，避免普通均价指标掩盖其真实价值。</w:t>
+        <w:t>第四种思路，是把高复本课程资源、高价影印本和研究型专题文献分开治理。课程教学需要的复本配置、民族地区研究需要的专题资料、长期保存需要的影印本和工具书，本来就不应使用同一套价格标准和论证方式。只有把这些板块拆开管理，馆员团队才可能同时兼顾成本控制与特色建设。</w:t>
       </w:r>
     </w:p>
     <w:p>
@@ -26204,13 +25981,7 @@
         <w:jc w:val="both"/>
       </w:pPr>
       <w:r>
-        <w:rPr>
-          <w:rFonts w:ascii="Times New Roman" w:hAnsi="Times New Roman" w:eastAsia="宋体"/>
-          <w:b w:val="0"/>
-          <w:color w:val="000000"/>
-          <w:sz w:val="24"/>
-        </w:rPr>
-        <w:t>第五，强化特色馆藏的服务转化。民族文献、民大文库、多卷工具书和捐赠资源不应仅被视为“特殊样本”，而应结合专题展示、文化传播、课程服务、书目编制和数字化利用等方式，转化为图书馆特色服务和办馆特色的一部分。这样既有利于提升实际服务能力，也有利于在竞赛文本中形成鲜明辨识度。</w:t>
+        <w:t>第五种思路，是让特色馆藏从“藏起来”走向“用起来”。如果民族文献、民大文库和相关专题资源能够与课程书单、专题书目、导读服务、数字化展示和研究支持结合起来，那么它们就不再只是馆藏结构中的一个小板块，而会真正转化为学校服务民族地区办学定位的资源优势。</w:t>
       </w:r>
     </w:p>
     <w:p>
@@ -26219,13 +25990,7 @@
         <w:jc w:val="left"/>
       </w:pPr>
       <w:r>
-        <w:rPr>
-          <w:rFonts w:ascii="Times New Roman" w:hAnsi="Times New Roman" w:eastAsia="黑体"/>
-          <w:b/>
-          <w:color w:val="000000"/>
-          <w:sz w:val="28"/>
-        </w:rPr>
-        <w:t>8. 结语</w:t>
+        <w:t>8. 决策时点</w:t>
       </w:r>
     </w:p>
     <w:p>
@@ -26235,13 +26000,7 @@
         <w:jc w:val="both"/>
       </w:pPr>
       <w:r>
-        <w:rPr>
-          <w:rFonts w:ascii="Times New Roman" w:hAnsi="Times New Roman" w:eastAsia="宋体"/>
-          <w:b w:val="0"/>
-          <w:color w:val="000000"/>
-          <w:sz w:val="24"/>
-        </w:rPr>
-        <w:t>总体来看，H大学图书馆五年馆藏建设已经呈现出较强的数据可解释性：一方面，新增馆藏并未停止增长，采购时效和资源来源总体可控；另一方面，馆藏结构已出现显著迁移，特色资源与常规资源并存的格局愈发清晰。对于图书馆而言，下一步工作的关键不再只是继续增加馆藏，而是要在中图法结构监测、采购来源优化、复本治理和特色资源转化之间建立更稳定的协同机制。只有这样，馆藏建设才能真正从“数量增长”迈向“结构优化”和“服务适配”。</w:t>
+        <w:t>2026年4月，H大学图书馆即将启动下一轮资源建设方案论证。馆长要求资源建设部在预算增幅有限的前提下，拿出一套既能回应学校一般学科教学科研需要、又能体现民族地区办学特色的馆藏优化方案。是延续近五年的通用学科结构调整逻辑，还是把民族地区文献、民族文献特色馆藏和共同体意识相关资源放到更核心的位置？哪些资源应纳入统一考核，哪些又应单列评价？民族文献借阅、民族文献阅览和民大文库之间又该如何分工？面对这些问题，资源建设部需要在下一次馆务会上给出选择。</w:t>
       </w:r>
     </w:p>
     <w:p>

</xml_diff>